<commit_message>
Contribute a working Next.js config for the documented WASM rough edge
Terminal 3's Quickstart asks anyone who finds a config that fixes WASM loading
under Next.js to report it. Integrating the SDK into a Next.js 16.2.6 app
(App Router, Turbopack) needs exactly two things: serverExternalPackages for
@terminal3/t3n-sdk, and runtime = nodejs on any route that imports it.

Also records the cold-start cost — ~10s first call, ~0.04s once the session is
memoised — which matters on serverless.
</commit_message>
<xml_diff>
--- a/submission/submission.docx
+++ b/submission/submission.docx
@@ -5250,6 +5250,232 @@
       <w:r>
         <w:rPr/>
       </w:r>
+    </w:p>
+    <w:p>
+      <w:pPr>
+        <w:pStyle w:val="Heading2"/>
+        <w:bidi w:val="0"/>
+        <w:jc w:val="left"/>
+        <w:rPr/>
+      </w:pPr>
+      <w:r>
+        <w:rPr/>
+        <w:t>A fix for the Next.js WASM rough edge you asked about</w:t>
+      </w:r>
+    </w:p>
+    <w:p>
+      <w:pPr>
+        <w:pStyle w:val="BodyText"/>
+        <w:bidi w:val="0"/>
+        <w:jc w:val="left"/>
+        <w:rPr/>
+      </w:pPr>
+      <w:r>
+        <w:rPr/>
+        <w:t>Not a bug — an answer to one you requested. The Quickstart says:</w:t>
+      </w:r>
+    </w:p>
+    <w:p>
+      <w:pPr>
+        <w:pStyle w:val="BlockQuotation"/>
+        <w:bidi w:val="0"/>
+        <w:jc w:val="left"/>
+        <w:rPr/>
+      </w:pPr>
+      <w:r>
+        <w:rPr/>
+        <w:t xml:space="preserve">We're tracking this as a known rough edge — </w:t>
+      </w:r>
+      <w:r>
+        <w:rPr>
+          <w:rStyle w:val="Strong"/>
+        </w:rPr>
+        <w:t>if you find a config that fixes it, tell us in the developer Telegram and we'll document it here properly.</w:t>
+      </w:r>
+    </w:p>
+    <w:p>
+      <w:pPr>
+        <w:pStyle w:val="BodyText"/>
+        <w:bidi w:val="0"/>
+        <w:jc w:val="left"/>
+        <w:rPr/>
+      </w:pPr>
+      <w:r>
+        <w:rPr/>
+        <w:t>I integrated the SDK into a Next.js 16.2.6 app (App Router, Turbopack) and it works. Two things are needed, and nothing else:</w:t>
+      </w:r>
+    </w:p>
+    <w:p>
+      <w:pPr>
+        <w:pStyle w:val="PreformattedText"/>
+        <w:bidi w:val="0"/>
+        <w:jc w:val="left"/>
+        <w:rPr/>
+      </w:pPr>
+      <w:r>
+        <w:rPr>
+          <w:rStyle w:val="SourceText"/>
+        </w:rPr>
+        <w:t>// next.config.ts — the SDK is not on Next's auto-externalised list</w:t>
+      </w:r>
+    </w:p>
+    <w:p>
+      <w:pPr>
+        <w:pStyle w:val="PreformattedText"/>
+        <w:bidi w:val="0"/>
+        <w:jc w:val="left"/>
+        <w:rPr/>
+      </w:pPr>
+      <w:r>
+        <w:rPr>
+          <w:rStyle w:val="SourceText"/>
+        </w:rPr>
+        <w:t>serverExternalPackages: ["@terminal3/t3n-sdk"]</w:t>
+      </w:r>
+    </w:p>
+    <w:p>
+      <w:pPr>
+        <w:pStyle w:val="PreformattedText"/>
+        <w:bidi w:val="0"/>
+        <w:jc w:val="left"/>
+        <w:rPr/>
+      </w:pPr>
+      <w:r>
+        <w:rPr/>
+      </w:r>
+    </w:p>
+    <w:p>
+      <w:pPr>
+        <w:pStyle w:val="PreformattedText"/>
+        <w:bidi w:val="0"/>
+        <w:jc w:val="left"/>
+        <w:rPr/>
+      </w:pPr>
+      <w:r>
+        <w:rPr>
+          <w:rStyle w:val="SourceText"/>
+        </w:rPr>
+        <w:t>// any route importing it — loadWasmComponent needs Node</w:t>
+      </w:r>
+    </w:p>
+    <w:p>
+      <w:pPr>
+        <w:pStyle w:val="PreformattedText"/>
+        <w:bidi w:val="0"/>
+        <w:spacing w:before="0" w:after="283"/>
+        <w:jc w:val="left"/>
+        <w:rPr/>
+      </w:pPr>
+      <w:r>
+        <w:rPr>
+          <w:rStyle w:val="SourceText"/>
+        </w:rPr>
+        <w:t>export const runtime = "nodejs"   // NOT "edge"</w:t>
+      </w:r>
+    </w:p>
+    <w:p>
+      <w:pPr>
+        <w:pStyle w:val="BodyText"/>
+        <w:bidi w:val="0"/>
+        <w:jc w:val="left"/>
+        <w:rPr/>
+      </w:pPr>
+      <w:r>
+        <w:rPr/>
+        <w:t xml:space="preserve">Verified in both </w:t>
+      </w:r>
+      <w:r>
+        <w:rPr>
+          <w:rStyle w:val="SourceText"/>
+        </w:rPr>
+        <w:t>next dev</w:t>
+      </w:r>
+      <w:r>
+        <w:rPr/>
+        <w:t xml:space="preserve"> (Turbopack) and </w:t>
+      </w:r>
+      <w:r>
+        <w:rPr>
+          <w:rStyle w:val="SourceText"/>
+        </w:rPr>
+        <w:t>next build</w:t>
+      </w:r>
+      <w:r>
+        <w:rPr/>
+        <w:t xml:space="preserve">: </w:t>
+      </w:r>
+      <w:r>
+        <w:rPr>
+          <w:rStyle w:val="SourceText"/>
+        </w:rPr>
+        <w:t>loadWasmComponent</w:t>
+      </w:r>
+      <w:r>
+        <w:rPr/>
+        <w:t xml:space="preserve">, </w:t>
+      </w:r>
+      <w:r>
+        <w:rPr>
+          <w:rStyle w:val="SourceText"/>
+        </w:rPr>
+        <w:t>fetchTrustedManifest</w:t>
+      </w:r>
+      <w:r>
+        <w:rPr/>
+        <w:t xml:space="preserve">, handshake, authenticate, </w:t>
+      </w:r>
+      <w:r>
+        <w:rPr>
+          <w:rStyle w:val="SourceText"/>
+        </w:rPr>
+        <w:t>getContractVersion</w:t>
+      </w:r>
+      <w:r>
+        <w:rPr/>
+        <w:t xml:space="preserve"> and </w:t>
+      </w:r>
+      <w:r>
+        <w:rPr>
+          <w:rStyle w:val="SourceText"/>
+        </w:rPr>
+        <w:t>executeAndDecode</w:t>
+      </w:r>
+      <w:r>
+        <w:rPr/>
+        <w:t xml:space="preserve"> against the live contract.</w:t>
+      </w:r>
+    </w:p>
+    <w:p>
+      <w:pPr>
+        <w:pStyle w:val="BodyText"/>
+        <w:bidi w:val="0"/>
+        <w:jc w:val="left"/>
+        <w:rPr/>
+      </w:pPr>
+      <w:r>
+        <w:rPr/>
+        <w:t>Worth documenting alongside it: the first call costs ~10s (WASM load + handshake + auth + version lookup) and later calls ~0.04s once memoised. On serverless that 10s hits every cold start, so the session wants caching at module scope with the in-flight promise shared.</w:t>
+      </w:r>
+    </w:p>
+    <w:p>
+      <w:pPr>
+        <w:pStyle w:val="BodyText"/>
+        <w:bidi w:val="0"/>
+        <w:jc w:val="left"/>
+        <w:rPr/>
+      </w:pPr>
+      <w:r>
+        <w:rPr/>
+        <w:t xml:space="preserve">The working integration is an AI chat agent that calls the eligibility contract as a tool and explains the result: </w:t>
+      </w:r>
+      <w:hyperlink r:id="rId12">
+        <w:r>
+          <w:rPr>
+            <w:rStyle w:val="Hyperlink"/>
+          </w:rPr>
+          <w:t>https://github.com/G-ojies/greyat-labs-chat</w:t>
+        </w:r>
+      </w:hyperlink>
     </w:p>
     <w:p>
       <w:pPr>

</xml_diff>

<commit_message>
Correct the serverless session-cost claim with measured data
Module-scope memoisation of the T3N session works locally (10.2s then 0.036s)
but does not help on Vercel serverless: five sequential production requests
measured 8.41s, 4.92s, 5.63s, 5.31s, 6.02s. The scope is not reliably reused
between invocations, so every request pays a fresh handshake.

The earlier note implied caching solves this. It does not, on a per-request
runtime, so the claim is replaced with the measurement.
</commit_message>
<xml_diff>
--- a/submission/submission.docx
+++ b/submission/submission.docx
@@ -5453,8 +5453,14 @@
         <w:rPr/>
       </w:pPr>
       <w:r>
-        <w:rPr/>
-        <w:t>Worth documenting alongside it: the first call costs ~10s (WASM load + handshake + auth + version lookup) and later calls ~0.04s once memoised. On serverless that 10s hits every cold start, so the session wants caching at module scope with the in-flight promise shared.</w:t>
+        <w:rPr>
+          <w:rStyle w:val="Strong"/>
+        </w:rPr>
+        <w:t>A serverless caveat worth documenting.</w:t>
+      </w:r>
+      <w:r>
+        <w:rPr/>
+        <w:t xml:space="preserve"> Locally, memoising the session at module scope works as you'd hope — 10.2s first call, 0.036s thereafter. On Vercel serverless it does not help at all; five sequential requests to a deployed function measured 8.41s, 4.92s, 5.63s, 5.31s, 6.02s. The module scope isn't reliably reused between invocations, so every request pays a fresh handshake. Anyone putting the ADK behind a serverless endpoint should budget ~5–8s per request, not just per cold start — and guidance on whether a session can be persisted or resumed across processes would be the thing that actually fixes it.</w:t>
       </w:r>
     </w:p>
     <w:p>

</xml_diff>